<commit_message>
Add full 36-rule breakdown to how_it_works, note exact count in tech reference
how_it_works.docx had no rules content at all -- added a plain-English
section covering all 36 detection rules, grouped by severity, matching
the exact conditions already documented in the technical reference.
full_technical_reference.docx's rule-list intro now states the exact
16/13/5/2 severity breakdown instead of just "the complete list".

Co-Authored-By: Claude Sonnet 5 <noreply@anthropic.com>
</commit_message>
<xml_diff>
--- a/audit-risk-report-generator_how_it_works.docx
+++ b/audit-risk-report-generator_how_it_works.docx
@@ -527,6 +527,560 @@
         <w:pStyle w:val="Heading1"/>
       </w:pPr>
       <w:r>
+        <w:t>What It Actually Checks — All 36 Rules</w:t>
+      </w:r>
+    </w:p>
+    <w:p>
+      <w:r>
+        <w:t>Every flag in a report traces back to one of 36 fixed, deterministic rules — the same 36 every time, on every filing. None of them involve the AI model making a judgment call; each one is a plain comparison against a company's own extracted figures or a specific phrase found in its own text. If a condition isn't met, the rule produces nothing — there's no partial credit or fuzzy scoring.</w:t>
+      </w:r>
+    </w:p>
+    <w:p>
+      <w:pPr>
+        <w:pStyle w:val="Heading2"/>
+      </w:pPr>
+      <w:r>
+        <w:t>High severity (16 rules, plus 2 that can also reach High — see below)</w:t>
+      </w:r>
+    </w:p>
+    <w:p>
+      <w:pPr>
+        <w:pStyle w:val="ListBullet"/>
+      </w:pPr>
+      <w:r>
+        <w:rPr>
+          <w:b/>
+        </w:rPr>
+        <w:t xml:space="preserve">Negative net worth — </w:t>
+      </w:r>
+      <w:r>
+        <w:t>The company's total equity has gone negative.</w:t>
+      </w:r>
+    </w:p>
+    <w:p>
+      <w:pPr>
+        <w:pStyle w:val="ListBullet"/>
+      </w:pPr>
+      <w:r>
+        <w:rPr>
+          <w:b/>
+        </w:rPr>
+        <w:t xml:space="preserve">Sharp cash decline — </w:t>
+      </w:r>
+      <w:r>
+        <w:t>Cash and bank balances fell more than 40%, and it's a big enough slice of the balance sheet to matter.</w:t>
+      </w:r>
+    </w:p>
+    <w:p>
+      <w:pPr>
+        <w:pStyle w:val="ListBullet"/>
+      </w:pPr>
+      <w:r>
+        <w:rPr>
+          <w:b/>
+        </w:rPr>
+        <w:t xml:space="preserve">A big new balance out of nowhere — </w:t>
+      </w:r>
+      <w:r>
+        <w:t>A line item that didn't exist last year suddenly shows up worth more than 3% of total assets.</w:t>
+      </w:r>
+    </w:p>
+    <w:p>
+      <w:pPr>
+        <w:pStyle w:val="ListBullet"/>
+      </w:pPr>
+      <w:r>
+        <w:rPr>
+          <w:b/>
+        </w:rPr>
+        <w:t xml:space="preserve">Profit not turning into cash — </w:t>
+      </w:r>
+      <w:r>
+        <w:t>Operating cash flow is less than 60% of reported profit — a classic earnings-quality red flag.</w:t>
+      </w:r>
+    </w:p>
+    <w:p>
+      <w:pPr>
+        <w:pStyle w:val="ListBullet"/>
+      </w:pPr>
+      <w:r>
+        <w:rPr>
+          <w:b/>
+        </w:rPr>
+        <w:t xml:space="preserve">Cash flow statement doesn't add up — </w:t>
+      </w:r>
+      <w:r>
+        <w:t>Opening cash plus the year's net flows doesn't equal the closing cash figure the company itself reported.</w:t>
+      </w:r>
+    </w:p>
+    <w:p>
+      <w:pPr>
+        <w:pStyle w:val="ListBullet"/>
+      </w:pPr>
+      <w:r>
+        <w:rPr>
+          <w:b/>
+        </w:rPr>
+        <w:t xml:space="preserve">Large new lease recognised — </w:t>
+      </w:r>
+      <w:r>
+        <w:t>Right-of-use assets more than doubled and are now a meaningful part of the balance sheet.</w:t>
+      </w:r>
+    </w:p>
+    <w:p>
+      <w:pPr>
+        <w:pStyle w:val="ListBullet"/>
+      </w:pPr>
+      <w:r>
+        <w:rPr>
+          <w:b/>
+        </w:rPr>
+        <w:t xml:space="preserve">Contingent liabilities jumped — </w:t>
+      </w:r>
+      <w:r>
+        <w:t>A material rise in off-balance-sheet exposure relative to equity.</w:t>
+      </w:r>
+    </w:p>
+    <w:p>
+      <w:pPr>
+        <w:pStyle w:val="ListBullet"/>
+      </w:pPr>
+      <w:r>
+        <w:rPr>
+          <w:b/>
+        </w:rPr>
+        <w:t xml:space="preserve">Other financial assets surged — </w:t>
+      </w:r>
+      <w:r>
+        <w:t>A sharp, material jump in this catch-all balance-sheet line.</w:t>
+      </w:r>
+    </w:p>
+    <w:p>
+      <w:pPr>
+        <w:pStyle w:val="ListBullet"/>
+      </w:pPr>
+      <w:r>
+        <w:rPr>
+          <w:b/>
+        </w:rPr>
+        <w:t xml:space="preserve">Bad-debt provisioning jumped sharply — </w:t>
+      </w:r>
+      <w:r>
+        <w:t>The expected credit loss allowance on receivables grew fast — an area CAG's own findings repeatedly flag.</w:t>
+      </w:r>
+    </w:p>
+    <w:p>
+      <w:pPr>
+        <w:pStyle w:val="ListBullet"/>
+      </w:pPr>
+      <w:r>
+        <w:rPr>
+          <w:b/>
+        </w:rPr>
+        <w:t xml:space="preserve">Signs of investment impairment — </w:t>
+      </w:r>
+      <w:r>
+        <w:t>The filing itself uses language suggesting a subsidiary/associate/JV investment has lost value.</w:t>
+      </w:r>
+    </w:p>
+    <w:p>
+      <w:pPr>
+        <w:pStyle w:val="ListBullet"/>
+      </w:pPr>
+      <w:r>
+        <w:rPr>
+          <w:b/>
+        </w:rPr>
+        <w:t xml:space="preserve">Fraud or investigation disclosed — </w:t>
+      </w:r>
+      <w:r>
+        <w:t>The company's own notes mention embezzlement, misappropriation, or a named regulatory/law-enforcement investigation.</w:t>
+      </w:r>
+    </w:p>
+    <w:p>
+      <w:pPr>
+        <w:pStyle w:val="ListBullet"/>
+      </w:pPr>
+      <w:r>
+        <w:rPr>
+          <w:b/>
+        </w:rPr>
+        <w:t xml:space="preserve">Auditor gave anything less than a clean opinion — </w:t>
+      </w:r>
+      <w:r>
+        <w:t>Qualified, Adverse, or Disclaimer of Opinion.</w:t>
+      </w:r>
+    </w:p>
+    <w:p>
+      <w:pPr>
+        <w:pStyle w:val="ListBullet"/>
+      </w:pPr>
+      <w:r>
+        <w:rPr>
+          <w:b/>
+        </w:rPr>
+        <w:t xml:space="preserve">Auditor added an Emphasis of Matter or Going-Concern paragraph — </w:t>
+      </w:r>
+      <w:r>
+        <w:t>A dedicated, named section auditors only include when something is genuinely worth separate attention.</w:t>
+      </w:r>
+    </w:p>
+    <w:p>
+      <w:pPr>
+        <w:pStyle w:val="ListBullet"/>
+      </w:pPr>
+      <w:r>
+        <w:rPr>
+          <w:b/>
+        </w:rPr>
+        <w:t xml:space="preserve">CAG's own review faulted the statutory auditor — </w:t>
+      </w:r>
+      <w:r>
+        <w:t>Not just the company — the auditor's own report was found deficient.</w:t>
+      </w:r>
+    </w:p>
+    <w:p>
+      <w:pPr>
+        <w:pStyle w:val="ListBullet"/>
+      </w:pPr>
+      <w:r>
+        <w:rPr>
+          <w:b/>
+        </w:rPr>
+        <w:t xml:space="preserve">Filing looks like it bundles more than one company — </w:t>
+      </w:r>
+      <w:r>
+        <w:t>Multiple company registration numbers (CINs) found in a single document.</w:t>
+      </w:r>
+    </w:p>
+    <w:p>
+      <w:pPr>
+        <w:pStyle w:val="ListBullet"/>
+      </w:pPr>
+      <w:r>
+        <w:rPr>
+          <w:b/>
+        </w:rPr>
+        <w:t xml:space="preserve">Tax figures in the note don't add up internally — </w:t>
+      </w:r>
+      <w:r>
+        <w:t>An arithmetic break in the company's own tax reconciliation.</w:t>
+      </w:r>
+    </w:p>
+    <w:p>
+      <w:pPr>
+        <w:pStyle w:val="Heading2"/>
+      </w:pPr>
+      <w:r>
+        <w:t>Medium severity (13 rules, plus 2 that can also land here)</w:t>
+      </w:r>
+    </w:p>
+    <w:p>
+      <w:pPr>
+        <w:pStyle w:val="ListBullet"/>
+      </w:pPr>
+      <w:r>
+        <w:rPr>
+          <w:b/>
+        </w:rPr>
+        <w:t xml:space="preserve">Receivables and revenue are moving in different directions — </w:t>
+      </w:r>
+      <w:r>
+        <w:t>Could mean slower collections, or aggressive revenue booking.</w:t>
+      </w:r>
+    </w:p>
+    <w:p>
+      <w:pPr>
+        <w:pStyle w:val="ListBullet"/>
+      </w:pPr>
+      <w:r>
+        <w:rPr>
+          <w:b/>
+        </w:rPr>
+        <w:t xml:space="preserve">Payables to small businesses grew fast — </w:t>
+      </w:r>
+      <w:r>
+        <w:t>A compliance exposure under the MSMED Act.</w:t>
+      </w:r>
+    </w:p>
+    <w:p>
+      <w:pPr>
+        <w:pStyle w:val="ListBullet"/>
+      </w:pPr>
+      <w:r>
+        <w:rPr>
+          <w:b/>
+        </w:rPr>
+        <w:t xml:space="preserve">Large one-off prior-year tax adjustment — </w:t>
+      </w:r>
+      <w:r>
+        <w:t>A chunky correction relative to this year's tax charge.</w:t>
+      </w:r>
+    </w:p>
+    <w:p>
+      <w:pPr>
+        <w:pStyle w:val="ListBullet"/>
+      </w:pPr>
+      <w:r>
+        <w:rPr>
+          <w:b/>
+        </w:rPr>
+        <w:t xml:space="preserve">Profit from joint ventures/associates fell sharply — </w:t>
+      </w:r>
+      <w:r>
+        <w:t>Can be an early impairment signal.</w:t>
+      </w:r>
+    </w:p>
+    <w:p>
+      <w:pPr>
+        <w:pStyle w:val="ListBullet"/>
+      </w:pPr>
+      <w:r>
+        <w:rPr>
+          <w:b/>
+        </w:rPr>
+        <w:t xml:space="preserve">CSR money not fully spent — </w:t>
+      </w:r>
+      <w:r>
+        <w:t>A Companies Act, Section 135 compliance point.</w:t>
+      </w:r>
+    </w:p>
+    <w:p>
+      <w:pPr>
+        <w:pStyle w:val="ListBullet"/>
+      </w:pPr>
+      <w:r>
+        <w:rPr>
+          <w:b/>
+        </w:rPr>
+        <w:t xml:space="preserve">Interest is accruing on late payments to small suppliers — </w:t>
+      </w:r>
+      <w:r>
+        <w:t>A distinct compliance signal from the payables-growth check above.</w:t>
+      </w:r>
+    </w:p>
+    <w:p>
+      <w:pPr>
+        <w:pStyle w:val="ListBullet"/>
+      </w:pPr>
+      <w:r>
+        <w:rPr>
+          <w:b/>
+        </w:rPr>
+        <w:t xml:space="preserve">Payables to larger suppliers dropped sharply — </w:t>
+      </w:r>
+      <w:r>
+        <w:t>Could mean an early or forced settlement.</w:t>
+      </w:r>
+    </w:p>
+    <w:p>
+      <w:pPr>
+        <w:pStyle w:val="ListBullet"/>
+      </w:pPr>
+      <w:r>
+        <w:rPr>
+          <w:b/>
+        </w:rPr>
+        <w:t xml:space="preserve">Two lease-related notes don't agree with each other — </w:t>
+      </w:r>
+      <w:r>
+        <w:t>A cross-check between new lease liabilities and new right-of-use assets.</w:t>
+      </w:r>
+    </w:p>
+    <w:p>
+      <w:pPr>
+        <w:pStyle w:val="ListBullet"/>
+      </w:pPr>
+      <w:r>
+        <w:rPr>
+          <w:b/>
+        </w:rPr>
+        <w:t xml:space="preserve">Long-term liabilities jumped — </w:t>
+      </w:r>
+      <w:r>
+        <w:t>A material shift in how the company is funded.</w:t>
+      </w:r>
+    </w:p>
+    <w:p>
+      <w:pPr>
+        <w:pStyle w:val="ListBullet"/>
+      </w:pPr>
+      <w:r>
+        <w:rPr>
+          <w:b/>
+        </w:rPr>
+        <w:t xml:space="preserve">Fixed-asset note doesn't reconcile — </w:t>
+      </w:r>
+      <w:r>
+        <w:t>The depreciation roll-forward in the Property, Plant &amp; Equipment note doesn't add up.</w:t>
+      </w:r>
+    </w:p>
+    <w:p>
+      <w:pPr>
+        <w:pStyle w:val="ListBullet"/>
+      </w:pPr>
+      <w:r>
+        <w:rPr>
+          <w:b/>
+        </w:rPr>
+        <w:t xml:space="preserve">Assets are “ready to use” but still sitting in CWIP — </w:t>
+      </w:r>
+      <w:r>
+        <w:t>Should have been moved onto the books and started depreciating.</w:t>
+      </w:r>
+    </w:p>
+    <w:p>
+      <w:pPr>
+        <w:pStyle w:val="ListBullet"/>
+      </w:pPr>
+      <w:r>
+        <w:rPr>
+          <w:b/>
+        </w:rPr>
+        <w:t xml:space="preserve">Audit trail wasn't running the whole year — </w:t>
+      </w:r>
+      <w:r>
+        <w:t>The company discloses the accounting software's audit-trail (edit log) wasn't continuously operational — a specific, named compliance rule (Rule 11(g)).</w:t>
+      </w:r>
+    </w:p>
+    <w:p>
+      <w:pPr>
+        <w:pStyle w:val="ListBullet"/>
+      </w:pPr>
+      <w:r>
+        <w:rPr>
+          <w:b/>
+        </w:rPr>
+        <w:t xml:space="preserve">Title deeds not in the company's own name — </w:t>
+      </w:r>
+      <w:r>
+        <w:t>A standard CARO disclosure that property ownership isn't clean.</w:t>
+      </w:r>
+    </w:p>
+    <w:p>
+      <w:pPr>
+        <w:pStyle w:val="Heading2"/>
+      </w:pPr>
+      <w:r>
+        <w:t>Low severity (5 rules, plus 2 that can also land here)</w:t>
+      </w:r>
+    </w:p>
+    <w:p>
+      <w:pPr>
+        <w:pStyle w:val="ListBullet"/>
+      </w:pPr>
+      <w:r>
+        <w:rPr>
+          <w:b/>
+        </w:rPr>
+        <w:t xml:space="preserve">Actuarial assumptions changed materially — </w:t>
+      </w:r>
+      <w:r>
+        <w:t>The discount rate used for retirement-benefit obligations moved meaningfully.</w:t>
+      </w:r>
+    </w:p>
+    <w:p>
+      <w:pPr>
+        <w:pStyle w:val="ListBullet"/>
+      </w:pPr>
+      <w:r>
+        <w:rPr>
+          <w:b/>
+        </w:rPr>
+        <w:t xml:space="preserve">A capital project has been “in progress” for years — </w:t>
+      </w:r>
+      <w:r>
+        <w:t>Schedule III requires ageing disclosure, and old CWIP projects are worth a second look.</w:t>
+      </w:r>
+    </w:p>
+    <w:p>
+      <w:pPr>
+        <w:pStyle w:val="ListBullet"/>
+      </w:pPr>
+      <w:r>
+        <w:rPr>
+          <w:b/>
+        </w:rPr>
+        <w:t xml:space="preserve">Unpaid or unclaimed dividend on the books — </w:t>
+      </w:r>
+      <w:r>
+        <w:t>Worth checking it's been transferred to the Investor Education &amp; Protection Fund on time.</w:t>
+      </w:r>
+    </w:p>
+    <w:p>
+      <w:pPr>
+        <w:pStyle w:val="ListBullet"/>
+      </w:pPr>
+      <w:r>
+        <w:rPr>
+          <w:b/>
+        </w:rPr>
+        <w:t xml:space="preserve">CSR note and CSR bank account don't match — </w:t>
+      </w:r>
+      <w:r>
+        <w:t>A cross-check between two places the same number should appear.</w:t>
+      </w:r>
+    </w:p>
+    <w:p>
+      <w:pPr>
+        <w:pStyle w:val="ListBullet"/>
+      </w:pPr>
+      <w:r>
+        <w:rPr>
+          <w:b/>
+        </w:rPr>
+        <w:t xml:space="preserve">Cash flow statement's column headers look wrong — </w:t>
+      </w:r>
+      <w:r>
+        <w:t>A labelling defect, not a real cash-flow problem — but still worth a query.</w:t>
+      </w:r>
+    </w:p>
+    <w:p>
+      <w:pPr>
+        <w:pStyle w:val="Heading2"/>
+      </w:pPr>
+      <w:r>
+        <w:t>Two rules that scale with the number, not fixed to one severity</w:t>
+      </w:r>
+    </w:p>
+    <w:p>
+      <w:r>
+        <w:t>These two don't have a single fixed severity — how bad the underlying number or wording is decides whether they land High, Medium, or Low:</w:t>
+      </w:r>
+    </w:p>
+    <w:p>
+      <w:pPr>
+        <w:pStyle w:val="ListBullet"/>
+      </w:pPr>
+      <w:r>
+        <w:rPr>
+          <w:b/>
+        </w:rPr>
+        <w:t xml:space="preserve">Any line item moving sharply year-on-year — </w:t>
+      </w:r>
+      <w:r>
+        <w:t>Checked automatically across the entire balance sheet and P&amp;L, not just a preset list. A 20–50% move is Low, 50–80% is Medium, over 80% is High. Small-rupee-amount items are excluded so the percentage swing alone can't trigger a flag.</w:t>
+      </w:r>
+    </w:p>
+    <w:p>
+      <w:pPr>
+        <w:pStyle w:val="ListBullet"/>
+      </w:pPr>
+      <w:r>
+        <w:rPr>
+          <w:b/>
+        </w:rPr>
+        <w:t xml:space="preserve">Unconfirmed balances — </w:t>
+      </w:r>
+      <w:r>
+        <w:t>The company discloses receivables, payables, or loans as “subject to confirmation.” Severity depends on how the company itself worded it: High if the auditor's own report elevated it into a qualification, Medium if a specific rupee figure was given, Low otherwise.</w:t>
+      </w:r>
+    </w:p>
+    <w:p>
+      <w:pPr>
+        <w:pStyle w:val="Heading1"/>
+      </w:pPr>
+      <w:r>
         <w:t>Where This Runs</w:t>
       </w:r>
     </w:p>

</xml_diff>